<commit_message>
github icon  and freelancing relating and  resume document  content changed
</commit_message>
<xml_diff>
--- a/public/Mahendharsoma-Resume.docx
+++ b/public/Mahendharsoma-Resume.docx
@@ -104,8 +104,13 @@
         <w:spacing w:before="40" w:after="40" w:line="269" w:lineRule="auto"/>
       </w:pPr>
       <w:r>
-        <w:t>Full Stack Web Developer with 8+ years of experience building scalable business applications using PHP, CodeIgniter 4, Next.js, JavaScript, and MySQL. Delivered ERP, SaaS, CMS, and custom platforms across education, transport, hospitality, and operations. Capable of building modern Next.js + MySQL applications and creating AI-assisted solutions for faster development, automation, and smarter workflows. Strong ownership from requirements through secure production deployment on Linux/cPanel with Git.</w:t>
+        <w:t>Full Stack Web Developer with 8+ years of experience building scalable business applications using PHP, CodeIgniter 4, Next.js, JavaScript, and MySQL. Delivered ERP, SaaS, CMS, and custom platforms across education, transport, hospitality, and operations. Capable of building modern Next.js + MySQL applications and creating AI-assisted solutions for faster development, automation, and smarter workflows. Strong ownership from requirements through secure production deployment on Linux/</w:t>
       </w:r>
+      <w:proofErr w:type="gramStart"/>
+      <w:r>
+        <w:t>cPanel .</w:t>
+      </w:r>
+      <w:proofErr w:type="gramEnd"/>
     </w:p>
     <w:p>
       <w:pPr>
@@ -463,7 +468,7 @@
         <w:rPr>
           <w:sz w:val="19"/>
         </w:rPr>
-        <w:t>Hardened security with validation, RBAC, and session management across multi-tenant products; owned Linux/cPanel and Git-based releases.</w:t>
+        <w:t>Hardened security with validation, RBAC, and session management across multi-tenant products; owned Linux/cPanel and production releases.</w:t>
       </w:r>
     </w:p>
     <w:p>
@@ -1051,7 +1056,7 @@
   <w:abstractNum w:abstractNumId="8" w15:restartNumberingAfterBreak="0">
     <w:nsid w:val="FFFFFF89"/>
     <w:multiLevelType w:val="singleLevel"/>
-    <w:tmpl w:val="29761A62"/>
+    <w:tmpl w:val="647C4C3C"/>
     <w:lvl w:ilvl="0">
       <w:start w:val="1"/>
       <w:numFmt w:val="bullet"/>
@@ -1705,7 +1710,6 @@
   <w:style w:type="character" w:default="1" w:styleId="DefaultParagraphFont">
     <w:name w:val="Default Paragraph Font"/>
     <w:uiPriority w:val="1"/>
-    <w:semiHidden/>
     <w:unhideWhenUsed/>
   </w:style>
   <w:style w:type="table" w:default="1" w:styleId="TableNormal">

</xml_diff>